<commit_message>
docs(requirements): number the SRD as v1.0 baseline (#6)
The text prepared as v0.4 becomes the reference edition v1.0; content
is unchanged. Later changes go through SRD §9.2 as v1.x. Team baseline
approval is still recorded by the PL in #6.

- rename 01_VOSS_SRD_v0.4 to 01_VOSS_SRD_v1.0 (Markdown and Word)
- update titles, status, change history, READMEs, manifests and hashes

Co-Authored-By: Claude Opus 5.5 <noreply@anthropic.com>
</commit_message>
<xml_diff>
--- a/docs/requirements/srd/word/00_배포_사용안내.docx
+++ b/docs/requirements/srd/word/00_배포_사용안내.docx
@@ -8,7 +8,7 @@
         <w:pStyle w:val="Heading1"/>
       </w:pPr>
       <w:r>
-        <w:t xml:space="preserve">VOSS SRD v0.4 — 배포·사용 안내</w:t>
+        <w:t xml:space="preserve">VOSS SRD v1.0 — 배포·사용 안내</w:t>
       </w:r>
     </w:p>
     <w:p>
@@ -53,7 +53,7 @@
         <w:pStyle w:val="BodyText"/>
       </w:pPr>
       <w:r>
-        <w:t xml:space="preserve">#50~#55의 전체 댓글과 최종 정정을 취합해 SRD v0.3을 작성했다. 기존 ISO/IEC/IEEE 29148:2018 참고 구성과 요구사항 ID를 유지하고, 합의된 좌표·시간·픽업·정지·적재·기록·집계·명령·배포·측정 규약을 본문에 반영했다. r1(10/07)에서 PR #77 리뷰에 따라 경로를 docs/requirements/srd/로 옮기고 중복 ZIP을 뺐으며, #50~#55 재대조 결과를 정정했다. v0.4에서 독립 재검 채택분과 main@671c67f 재대조를 반영해 취합자 확정본으로 정리했다(01 변경 이력).</w:t>
+        <w:t xml:space="preserve">#50~#55의 전체 댓글과 최종 정정을 취합해 SRD v0.3을 작성했다. 기존 ISO/IEC/IEEE 29148:2018 참고 구성과 요구사항 ID를 유지하고, 합의된 좌표·시간·픽업·정지·적재·기록·집계·명령·배포·측정 규약을 본문에 반영했다. r1(10/07)에서 PR #77 리뷰에 따라 경로를 docs/requirements/srd/로 옮기고 중복 ZIP을 뺐으며, #50~#55 재대조 결과를 정정했다. v1.0에서 독립 재검 채택분과 main@671c67f 재대조를 반영해 기준 문서로 정리했다(작업 중 v0.4로 부르던 판)(01 변경 이력).</w:t>
       </w:r>
     </w:p>
     <w:tbl>
@@ -140,7 +140,7 @@
                 <w:rFonts w:ascii="Noto Sans CJK KR" w:hAnsi="Noto Sans CJK KR" w:eastAsia="Noto Sans CJK KR"/>
                 <w:sz w:val="18"/>
               </w:rPr>
-              <w:t xml:space="preserve">01_VOSS_SRD_v0.4</w:t>
+              <w:t xml:space="preserve">01_VOSS_SRD_v1.0</w:t>
             </w:r>
           </w:p>
         </w:tc>
@@ -161,7 +161,7 @@
                 <w:rFonts w:ascii="Noto Sans CJK KR" w:hAnsi="Noto Sans CJK KR" w:eastAsia="Noto Sans CJK KR"/>
                 <w:sz w:val="18"/>
               </w:rPr>
-              <w:t xml:space="preserve">시스템 요구사항 본문(v0.4 취합자 확정본, 팀 기준선 승인은 #6)</w:t>
+              <w:t xml:space="preserve">시스템 요구사항 본문(v1.0 기준 문서, 팀 기준선 승인 기록은 #6)</w:t>
             </w:r>
           </w:p>
         </w:tc>

</xml_diff>